<commit_message>
Update contact email to hi@abdumurad.com (site + offer collateral)
</commit_message>
<xml_diff>
--- a/public/offers/elpr-2026/Website-Development-Proposal-Aug2026.docx
+++ b/public/offers/elpr-2026/Website-Development-Proposal-Aug2026.docx
@@ -41,7 +41,7 @@
           <w:color w:val="595959"/>
           <w:sz w:val="21"/>
         </w:rPr>
-        <w:t>Prepared by: Abdu Murad   ·   abadeem@gmail.com</w:t>
+        <w:t>Prepared by: Abdu Murad   ·   hi@abdumurad.com   ·   abdumurad.com</w:t>
       </w:r>
     </w:p>
     <w:p>
@@ -990,7 +990,7 @@
         <w:rPr>
           <w:sz w:val="21"/>
         </w:rPr>
-        <w:t>SSL certificates setup (secure https), website analytics, and search-engine-friendly structure.</w:t>
+        <w:t>SSL certificates setup (secure https), analytics dashboard setup with client access, and search-engine-friendly structure.</w:t>
       </w:r>
     </w:p>
     <w:p>
@@ -1002,7 +1002,7 @@
         <w:rPr>
           <w:sz w:val="21"/>
         </w:rPr>
-        <w:t>Two design revision rounds per website.</w:t>
+        <w:t>One design revision round per website.</w:t>
       </w:r>
     </w:p>
     <w:p>
@@ -1293,7 +1293,19 @@
         <w:rPr>
           <w:sz w:val="21"/>
         </w:rPr>
-        <w:t>Two design revision rounds per website are included; additional rounds are quoted separately.</w:t>
+        <w:t>One consolidated design revision round per website is included (a single set of change requests after the design presentation); additional rounds are quoted separately.</w:t>
+      </w:r>
+    </w:p>
+    <w:p>
+      <w:pPr>
+        <w:pStyle w:val="ListBullet"/>
+        <w:spacing w:after="60"/>
+      </w:pPr>
+      <w:r>
+        <w:rPr>
+          <w:sz w:val="21"/>
+        </w:rPr>
+        <w:t>Analytics: dashboard setup with client viewer access is included; prepared or interpreted reports are handled as change requests.</w:t>
       </w:r>
     </w:p>
     <w:p>

</xml_diff>